<commit_message>
Align project document wording with actual gadifff architecture
</commit_message>
<xml_diff>
--- a/Eitan Mamedov - תיק פרויקט בחלופה_ שירותי אינטרנט, תכנות אסינכרוני ומסדי נתונים (883589) - answered.docx
+++ b/Eitan Mamedov - תיק פרויקט בחלופה_ שירותי אינטרנט, תכנות אסינכרוני ומסדי נתונים (883589) - answered.docx
@@ -11011,31 +11011,31 @@
           <w:szCs w:val="24"/>
           <w:rtl w:val="1"/>
         </w:rPr>
-        <w:t xml:space="preserve">שכבת</w:t>
-      </w:r>
-      <w:r>
-        <w:rPr>
-          <w:sz w:val="24"/>
-          <w:szCs w:val="24"/>
-          <w:rtl w:val="1"/>
-        </w:rPr>
-        <w:t xml:space="preserve"> </w:t>
-      </w:r>
-      <w:r>
-        <w:rPr>
-          <w:sz w:val="24"/>
-          <w:szCs w:val="24"/>
-          <w:rtl w:val="1"/>
-        </w:rPr>
-        <w:t xml:space="preserve">ה</w:t>
-      </w:r>
-      <w:r>
-        <w:rPr>
-          <w:sz w:val="24"/>
-          <w:szCs w:val="24"/>
-          <w:rtl w:val="1"/>
-        </w:rPr>
-        <w:t xml:space="preserve">-</w:t>
+        <w:t xml:space="preserve">???? ????? ??????</w:t>
+      </w:r>
+      <w:r>
+        <w:rPr>
+          <w:sz w:val="24"/>
+          <w:szCs w:val="24"/>
+          <w:rtl w:val="1"/>
+        </w:rPr>
+        <w:t xml:space="preserve"/>
+      </w:r>
+      <w:r>
+        <w:rPr>
+          <w:sz w:val="24"/>
+          <w:szCs w:val="24"/>
+          <w:rtl w:val="1"/>
+        </w:rPr>
+        <w:t xml:space="preserve"/>
+      </w:r>
+      <w:r>
+        <w:rPr>
+          <w:sz w:val="24"/>
+          <w:szCs w:val="24"/>
+          <w:rtl w:val="1"/>
+        </w:rPr>
+        <w:t xml:space="preserve"/>
       </w:r>
       <w:r>
         <w:rPr>
@@ -11043,47 +11043,47 @@
           <w:szCs w:val="24"/>
           <w:rtl w:val="0"/>
         </w:rPr>
-        <w:t xml:space="preserve">ViewModel</w:t>
-      </w:r>
-      <w:r>
-        <w:rPr>
-          <w:sz w:val="24"/>
-          <w:szCs w:val="24"/>
-          <w:rtl w:val="1"/>
-        </w:rPr>
-        <w:t xml:space="preserve"> (</w:t>
-      </w:r>
-      <w:r>
-        <w:rPr>
-          <w:sz w:val="24"/>
-          <w:szCs w:val="24"/>
-          <w:rtl w:val="1"/>
-        </w:rPr>
-        <w:t xml:space="preserve">טיפול</w:t>
-      </w:r>
-      <w:r>
-        <w:rPr>
-          <w:sz w:val="24"/>
-          <w:szCs w:val="24"/>
-          <w:rtl w:val="1"/>
-        </w:rPr>
-        <w:t xml:space="preserve"> </w:t>
-      </w:r>
-      <w:r>
-        <w:rPr>
-          <w:sz w:val="24"/>
-          <w:szCs w:val="24"/>
-          <w:rtl w:val="1"/>
-        </w:rPr>
-        <w:t xml:space="preserve">בנתונים</w:t>
-      </w:r>
-      <w:r>
-        <w:rPr>
-          <w:sz w:val="24"/>
-          <w:szCs w:val="24"/>
-          <w:rtl w:val="1"/>
-        </w:rPr>
-        <w:t xml:space="preserve">)</w:t>
+        <w:t xml:space="preserve"/>
+      </w:r>
+      <w:r>
+        <w:rPr>
+          <w:sz w:val="24"/>
+          <w:szCs w:val="24"/>
+          <w:rtl w:val="1"/>
+        </w:rPr>
+        <w:t xml:space="preserve"/>
+      </w:r>
+      <w:r>
+        <w:rPr>
+          <w:sz w:val="24"/>
+          <w:szCs w:val="24"/>
+          <w:rtl w:val="1"/>
+        </w:rPr>
+        <w:t xml:space="preserve"/>
+      </w:r>
+      <w:r>
+        <w:rPr>
+          <w:sz w:val="24"/>
+          <w:szCs w:val="24"/>
+          <w:rtl w:val="1"/>
+        </w:rPr>
+        <w:t xml:space="preserve"/>
+      </w:r>
+      <w:r>
+        <w:rPr>
+          <w:sz w:val="24"/>
+          <w:szCs w:val="24"/>
+          <w:rtl w:val="1"/>
+        </w:rPr>
+        <w:t xml:space="preserve"/>
+      </w:r>
+      <w:r>
+        <w:rPr>
+          <w:sz w:val="24"/>
+          <w:szCs w:val="24"/>
+          <w:rtl w:val="1"/>
+        </w:rPr>
+        <w:t xml:space="preserve"/>
       </w:r>
     </w:p>
     <w:p ns1:paraId="0000005F">

</xml_diff>